<commit_message>
make decision for some vague statements
</commit_message>
<xml_diff>
--- a/Business Analysis.docx
+++ b/Business Analysis.docx
@@ -2,36 +2,6 @@
 <file path=word/document.xml><?xml version="1.0" encoding="utf-8"?>
 <w:document xmlns:wpc="http://schemas.microsoft.com/office/word/2010/wordprocessingCanvas" xmlns:cx="http://schemas.microsoft.com/office/drawing/2014/chartex" xmlns:cx1="http://schemas.microsoft.com/office/drawing/2015/9/8/chartex" xmlns:cx2="http://schemas.microsoft.com/office/drawing/2015/10/21/chartex" xmlns:cx3="http://schemas.microsoft.com/office/drawing/2016/5/9/chartex" xmlns:cx4="http://schemas.microsoft.com/office/drawing/2016/5/10/chartex" xmlns:cx5="http://schemas.microsoft.com/office/drawing/2016/5/11/chartex" xmlns:cx6="http://schemas.microsoft.com/office/drawing/2016/5/12/chartex" xmlns:cx7="http://schemas.microsoft.com/office/drawing/2016/5/13/chartex" xmlns:cx8="http://schemas.microsoft.com/office/drawing/2016/5/14/chartex" xmlns:mc="http://schemas.openxmlformats.org/markup-compatibility/2006" xmlns:o="urn:schemas-microsoft-com:office:office" xmlns:r="http://schemas.openxmlformats.org/officeDocument/2006/relationships" xmlns:m="http://schemas.openxmlformats.org/officeDocument/2006/math" xmlns:v="urn:schemas-microsoft-com:vml" xmlns:wp14="http://schemas.microsoft.com/office/word/2010/wordprocessingDrawing" xmlns:wp="http://schemas.openxmlformats.org/drawingml/2006/wordprocessingDrawing" xmlns:w="http://schemas.openxmlformats.org/wordprocessingml/2006/main" xmlns:w14="http://schemas.microsoft.com/office/word/2010/wordml" xmlns:w10="urn:schemas-microsoft-com:office:word" xmlns:w15="http://schemas.microsoft.com/office/word/2012/wordml" xmlns:wpg="http://schemas.microsoft.com/office/word/2010/wordprocessingGroup" xmlns:wpi="http://schemas.microsoft.com/office/word/2010/wordprocessingInk" xmlns:wne="http://schemas.microsoft.com/office/word/2006/wordml" xmlns:wps="http://schemas.microsoft.com/office/word/2010/wordprocessingShape" xmlns:wpsCustomData="http://www.wps.cn/officeDocument/2013/wpsCustomData" mc:Ignorable="w14 w15 wp14">
   <w:body>
-    <w:p>
-      <w:pPr>
-        <w:numPr>
-          <w:ilvl w:val="0"/>
-          <w:numId w:val="1"/>
-        </w:numPr>
-        <w:rPr>
-          <w:rFonts w:hint="default"/>
-          <w:lang w:val="en-US"/>
-        </w:rPr>
-      </w:pPr>
-      <w:r>
-        <w:rPr>
-          <w:rFonts w:hint="default"/>
-          <w:lang w:val="en-US"/>
-        </w:rPr>
-        <w:t xml:space="preserve">Currently, only </w:t>
-      </w:r>
-    </w:p>
-    <w:p>
-      <w:pPr>
-        <w:numPr>
-          <w:numId w:val="0"/>
-        </w:numPr>
-        <w:rPr>
-          <w:rFonts w:hint="default"/>
-          <w:lang w:val="en-US"/>
-        </w:rPr>
-      </w:pPr>
-    </w:p>
     <w:p>
       <w:pPr>
         <w:numPr>
@@ -90,7 +60,7 @@
       <w:pPr>
         <w:numPr>
           <w:ilvl w:val="0"/>
-          <w:numId w:val="2"/>
+          <w:numId w:val="1"/>
         </w:numPr>
         <w:rPr>
           <w:rFonts w:hint="default"/>
@@ -109,7 +79,7 @@
       <w:pPr>
         <w:numPr>
           <w:ilvl w:val="0"/>
-          <w:numId w:val="2"/>
+          <w:numId w:val="1"/>
         </w:numPr>
         <w:rPr>
           <w:rFonts w:hint="default"/>
@@ -128,7 +98,7 @@
       <w:pPr>
         <w:numPr>
           <w:ilvl w:val="0"/>
-          <w:numId w:val="2"/>
+          <w:numId w:val="1"/>
         </w:numPr>
         <w:rPr>
           <w:rFonts w:hint="default"/>
@@ -201,28 +171,19 @@
       <w:pPr>
         <w:numPr>
           <w:ilvl w:val="0"/>
-          <w:numId w:val="3"/>
-        </w:numPr>
-        <w:rPr>
-          <w:rFonts w:hint="default"/>
-          <w:lang w:val="en-US"/>
-        </w:rPr>
-      </w:pPr>
-      <w:r>
-        <w:rPr>
-          <w:rFonts w:hint="default"/>
-          <w:lang w:val="en-US"/>
-        </w:rPr>
-        <w:t>Tạo 1 clip quảng cáo bằng AI, nội dung là câu chuyện khá quen thuộc và hấp dẫn, đó là: “Có 1 cặp nam nữ yêu nhau, xong lúc ch</w:t>
-      </w:r>
-      <w:bookmarkStart w:id="0" w:name="_GoBack"/>
-      <w:bookmarkEnd w:id="0"/>
-      <w:r>
-        <w:rPr>
-          <w:rFonts w:hint="default"/>
-          <w:lang w:val="en-US"/>
-        </w:rPr>
-        <w:t>uẩn bị đi date thì bạn nữ xà quần rồi nói KHÔNG BIẾT MẶC GÌ.. xong bạn nam mới ĐƯA APP RA chẳng hạn, rồi khúc sau show các outfit (+ghép nhạc ngầu ngầu đồ..) rồi cả 2 tung tăng đi chơi chẳng hạn..</w:t>
+          <w:numId w:val="2"/>
+        </w:numPr>
+        <w:rPr>
+          <w:rFonts w:hint="default"/>
+          <w:lang w:val="en-US"/>
+        </w:rPr>
+      </w:pPr>
+      <w:r>
+        <w:rPr>
+          <w:rFonts w:hint="default"/>
+          <w:lang w:val="en-US"/>
+        </w:rPr>
+        <w:t>Tạo 1 clip quảng cáo bằng AI, nội dung là câu chuyện khá quen thuộc và hấp dẫn, đó là: “Có 1 cặp nam nữ yêu nhau, xong lúc chuẩn bị đi date thì bạn nữ xà quần rồi nói KHÔNG BIẾT MẶC GÌ.. xong bạn nam mới ĐƯA APP RA chẳng hạn, rồi khúc sau show các outfit (+ghép nhạc ngầu ngầu đồ..) rồi cả 2 tung tăng đi chơi chẳng hạn..</w:t>
       </w:r>
     </w:p>
     <w:p>
@@ -284,7 +245,7 @@
       <w:pPr>
         <w:numPr>
           <w:ilvl w:val="0"/>
-          <w:numId w:val="4"/>
+          <w:numId w:val="3"/>
         </w:numPr>
         <w:rPr>
           <w:rFonts w:hint="default"/>
@@ -303,7 +264,7 @@
       <w:pPr>
         <w:numPr>
           <w:ilvl w:val="0"/>
-          <w:numId w:val="4"/>
+          <w:numId w:val="3"/>
         </w:numPr>
         <w:rPr>
           <w:rFonts w:hint="default"/>
@@ -322,16 +283,18 @@
       <w:pPr>
         <w:numPr>
           <w:ilvl w:val="0"/>
-          <w:numId w:val="4"/>
-        </w:numPr>
-        <w:rPr>
-          <w:rFonts w:hint="default"/>
-          <w:lang w:val="en-US"/>
-        </w:rPr>
-      </w:pPr>
-      <w:r>
-        <w:rPr>
-          <w:rFonts w:hint="default"/>
+          <w:numId w:val="3"/>
+        </w:numPr>
+        <w:rPr>
+          <w:rFonts w:hint="default"/>
+          <w:color w:val="00B050"/>
+          <w:lang w:val="en-US"/>
+        </w:rPr>
+      </w:pPr>
+      <w:r>
+        <w:rPr>
+          <w:rFonts w:hint="default"/>
+          <w:color w:val="00B050"/>
           <w:lang w:val="en-US"/>
         </w:rPr>
         <w:t>Which does each role (FE, BE, AI) need to implement?</w:t>
@@ -341,7 +304,7 @@
       <w:pPr>
         <w:numPr>
           <w:ilvl w:val="0"/>
-          <w:numId w:val="4"/>
+          <w:numId w:val="3"/>
         </w:numPr>
         <w:rPr>
           <w:rFonts w:hint="default"/>
@@ -418,6 +381,90 @@
       <w:pPr>
         <w:numPr>
           <w:ilvl w:val="0"/>
+          <w:numId w:val="4"/>
+        </w:numPr>
+        <w:rPr>
+          <w:rFonts w:hint="default"/>
+          <w:lang w:val="en-US"/>
+        </w:rPr>
+      </w:pPr>
+      <w:r>
+        <w:rPr>
+          <w:rFonts w:hint="default"/>
+          <w:lang w:val="en-US"/>
+        </w:rPr>
+        <w:t>Which workflow should I follow?</w:t>
+      </w:r>
+    </w:p>
+    <w:p>
+      <w:pPr>
+        <w:numPr>
+          <w:numId w:val="0"/>
+        </w:numPr>
+        <w:rPr>
+          <w:rFonts w:hint="default"/>
+          <w:lang w:val="en-US"/>
+        </w:rPr>
+      </w:pPr>
+    </w:p>
+    <w:p>
+      <w:pPr>
+        <w:numPr>
+          <w:numId w:val="0"/>
+        </w:numPr>
+        <w:pBdr>
+          <w:bottom w:val="single" w:color="auto" w:sz="4" w:space="0"/>
+        </w:pBdr>
+        <w:rPr>
+          <w:rFonts w:hint="default"/>
+          <w:lang w:val="en-US"/>
+        </w:rPr>
+      </w:pPr>
+    </w:p>
+    <w:p>
+      <w:pPr>
+        <w:numPr>
+          <w:numId w:val="0"/>
+        </w:numPr>
+        <w:rPr>
+          <w:rFonts w:hint="default"/>
+          <w:lang w:val="en-US"/>
+        </w:rPr>
+      </w:pPr>
+    </w:p>
+    <w:p>
+      <w:pPr>
+        <w:numPr>
+          <w:numId w:val="0"/>
+        </w:numPr>
+        <w:jc w:val="center"/>
+        <w:rPr>
+          <w:rFonts w:hint="default"/>
+          <w:b/>
+          <w:bCs/>
+          <w:color w:val="FF0000"/>
+          <w:sz w:val="32"/>
+          <w:szCs w:val="32"/>
+          <w:lang w:val="en-US"/>
+        </w:rPr>
+      </w:pPr>
+      <w:r>
+        <w:rPr>
+          <w:rFonts w:hint="default"/>
+          <w:b/>
+          <w:bCs/>
+          <w:color w:val="FF0000"/>
+          <w:sz w:val="32"/>
+          <w:szCs w:val="32"/>
+          <w:lang w:val="en-US"/>
+        </w:rPr>
+        <w:t>CHANGE LOG</w:t>
+      </w:r>
+    </w:p>
+    <w:p>
+      <w:pPr>
+        <w:numPr>
+          <w:ilvl w:val="0"/>
           <w:numId w:val="5"/>
         </w:numPr>
         <w:rPr>
@@ -430,8 +477,22 @@
           <w:rFonts w:hint="default"/>
           <w:lang w:val="en-US"/>
         </w:rPr>
-        <w:t>Which workflow should I follow?</w:t>
-      </w:r>
+        <w:t>Use PostgreSQL instead of MongoDB</w:t>
+      </w:r>
+    </w:p>
+    <w:p>
+      <w:pPr>
+        <w:numPr>
+          <w:ilvl w:val="0"/>
+          <w:numId w:val="5"/>
+        </w:numPr>
+        <w:rPr>
+          <w:rFonts w:hint="default"/>
+          <w:lang w:val="en-US"/>
+        </w:rPr>
+      </w:pPr>
+      <w:bookmarkStart w:id="0" w:name="_GoBack"/>
+      <w:bookmarkEnd w:id="0"/>
     </w:p>
     <w:p>
       <w:pPr>
@@ -505,9 +566,9 @@
     </w:lvl>
   </w:abstractNum>
   <w:abstractNum w:abstractNumId="4">
-    <w:nsid w:val="6337AE7B"/>
+    <w:nsid w:val="7B622625"/>
     <w:multiLevelType w:val="singleLevel"/>
-    <w:tmpl w:val="6337AE7B"/>
+    <w:tmpl w:val="7B622625"/>
     <w:lvl w:ilvl="0" w:tentative="0">
       <w:start w:val="1"/>
       <w:numFmt w:val="decimal"/>
@@ -517,19 +578,19 @@
     </w:lvl>
   </w:abstractNum>
   <w:num w:numId="1">
-    <w:abstractNumId w:val="4"/>
+    <w:abstractNumId w:val="3"/>
   </w:num>
   <w:num w:numId="2">
-    <w:abstractNumId w:val="3"/>
+    <w:abstractNumId w:val="0"/>
   </w:num>
   <w:num w:numId="3">
-    <w:abstractNumId w:val="0"/>
+    <w:abstractNumId w:val="1"/>
   </w:num>
   <w:num w:numId="4">
-    <w:abstractNumId w:val="1"/>
+    <w:abstractNumId w:val="2"/>
   </w:num>
   <w:num w:numId="5">
-    <w:abstractNumId w:val="2"/>
+    <w:abstractNumId w:val="4"/>
   </w:num>
 </w:numbering>
 </file>

</xml_diff>